<commit_message>
Fix: Print itd acts
</commit_message>
<xml_diff>
--- a/templates/itd/act_1.docx
+++ b/templates/itd/act_1.docx
@@ -11,85 +11,291 @@
       </w:pPr>
       <w:r>
         <w:rPr/>
-        <w:t>Проект: {project_cipher}</w:t>
-      </w:r>
-    </w:p>
-    <w:p>
-      <w:pPr>
-        <w:pStyle w:val="Normal"/>
-        <w:bidi w:val="0"/>
-        <w:jc w:val="start"/>
-        <w:rPr/>
-      </w:pPr>
-      <w:r>
-        <w:rPr/>
-        <w:t>Дата начала: {start_date}</w:t>
-      </w:r>
-    </w:p>
-    <w:p>
-      <w:pPr>
-        <w:pStyle w:val="Normal"/>
-        <w:bidi w:val="0"/>
-        <w:jc w:val="start"/>
-        <w:rPr/>
-      </w:pPr>
-      <w:r>
-        <w:rPr/>
-        <w:t>Дата окончания: {end_date}</w:t>
-      </w:r>
-    </w:p>
-    <w:p>
-      <w:pPr>
-        <w:pStyle w:val="Normal"/>
-        <w:bidi w:val="0"/>
-        <w:jc w:val="start"/>
-        <w:rPr/>
-      </w:pPr>
-      <w:r>
-        <w:rPr/>
-      </w:r>
-    </w:p>
-    <w:p>
-      <w:pPr>
-        <w:pStyle w:val="Normal"/>
-        <w:bidi w:val="0"/>
-        <w:jc w:val="start"/>
-        <w:rPr/>
-      </w:pPr>
-      <w:r>
-        <w:rPr/>
-      </w:r>
-    </w:p>
-    <w:p>
-      <w:pPr>
-        <w:pStyle w:val="Normal"/>
-        <w:bidi w:val="0"/>
-        <w:jc w:val="start"/>
-        <w:rPr/>
-      </w:pPr>
-      <w:r>
-        <w:rPr/>
-        <w:t>Дата осмотра: {inspection_date}</w:t>
-      </w:r>
-    </w:p>
-    <w:p>
-      <w:pPr>
-        <w:pStyle w:val="Normal"/>
-        <w:bidi w:val="0"/>
-        <w:jc w:val="start"/>
-        <w:rPr/>
-      </w:pPr>
-      <w:r>
-        <w:rPr/>
-        <w:t>Температура: {</w:t>
-      </w:r>
-      <w:r>
-        <w:rPr/>
-        <w:t>temperature</w:t>
+        <w:t>Недоделки: {deficiencies}</w:t>
+      </w:r>
+    </w:p>
+    <w:p>
+      <w:pPr>
+        <w:pStyle w:val="Normal"/>
+        <w:bidi w:val="0"/>
+        <w:jc w:val="start"/>
+        <w:rPr/>
+      </w:pPr>
+      <w:r>
+        <w:rPr/>
+      </w:r>
+    </w:p>
+    <w:p>
+      <w:pPr>
+        <w:pStyle w:val="Normal"/>
+        <w:bidi w:val="0"/>
+        <w:jc w:val="start"/>
+        <w:rPr/>
+      </w:pPr>
+      <w:r>
+        <w:rPr/>
+        <w:t>Шифр проекта: {</w:t>
+      </w:r>
+      <w:r>
+        <w:rPr/>
+        <w:t>project_name}</w:t>
+      </w:r>
+    </w:p>
+    <w:p>
+      <w:pPr>
+        <w:pStyle w:val="Normal"/>
+        <w:bidi w:val="0"/>
+        <w:jc w:val="start"/>
+        <w:rPr/>
+      </w:pPr>
+      <w:r>
+        <w:rPr/>
+        <w:t>Полное наименование проекта: {</w:t>
+      </w:r>
+      <w:r>
+        <w:rPr/>
+        <w:t>project_full_name</w:t>
       </w:r>
       <w:r>
         <w:rPr/>
         <w:t>}</w:t>
+      </w:r>
+    </w:p>
+    <w:p>
+      <w:pPr>
+        <w:pStyle w:val="Normal"/>
+        <w:bidi w:val="0"/>
+        <w:jc w:val="start"/>
+        <w:rPr/>
+      </w:pPr>
+      <w:r>
+        <w:rPr/>
+      </w:r>
+    </w:p>
+    <w:p>
+      <w:pPr>
+        <w:pStyle w:val="Normal"/>
+        <w:bidi w:val="0"/>
+        <w:jc w:val="start"/>
+        <w:rPr/>
+      </w:pPr>
+      <w:r>
+        <w:rPr/>
+        <w:t xml:space="preserve">Объект: </w:t>
+      </w:r>
+      <w:r>
+        <w:rPr/>
+        <w:t>{project_object_name}</w:t>
+      </w:r>
+    </w:p>
+    <w:p>
+      <w:pPr>
+        <w:pStyle w:val="Normal"/>
+        <w:bidi w:val="0"/>
+        <w:jc w:val="start"/>
+        <w:rPr/>
+      </w:pPr>
+      <w:r>
+        <w:rPr/>
+        <w:t>Город: {</w:t>
+      </w:r>
+      <w:r>
+        <w:rPr/>
+        <w:t>project_object_city</w:t>
+      </w:r>
+      <w:r>
+        <w:rPr/>
+        <w:t>}</w:t>
+      </w:r>
+    </w:p>
+    <w:p>
+      <w:pPr>
+        <w:pStyle w:val="Normal"/>
+        <w:bidi w:val="0"/>
+        <w:jc w:val="start"/>
+        <w:rPr/>
+      </w:pPr>
+      <w:r>
+        <w:rPr/>
+      </w:r>
+    </w:p>
+    <w:p>
+      <w:pPr>
+        <w:pStyle w:val="Normal"/>
+        <w:bidi w:val="0"/>
+        <w:jc w:val="start"/>
+        <w:rPr/>
+      </w:pPr>
+      <w:r>
+        <w:rPr/>
+        <w:t>{#customer_rep}</w:t>
+      </w:r>
+    </w:p>
+    <w:p>
+      <w:pPr>
+        <w:pStyle w:val="Normal"/>
+        <w:bidi w:val="0"/>
+        <w:jc w:val="start"/>
+        <w:rPr/>
+      </w:pPr>
+      <w:r>
+        <w:rPr/>
+        <w:t>Представитель заказчика:</w:t>
+      </w:r>
+    </w:p>
+    <w:p>
+      <w:pPr>
+        <w:pStyle w:val="Normal"/>
+        <w:bidi w:val="0"/>
+        <w:jc w:val="start"/>
+        <w:rPr/>
+      </w:pPr>
+      <w:r>
+        <w:rPr/>
+        <w:t>Должность: {customer_rep_pos}</w:t>
+      </w:r>
+    </w:p>
+    <w:p>
+      <w:pPr>
+        <w:pStyle w:val="Normal"/>
+        <w:bidi w:val="0"/>
+        <w:jc w:val="start"/>
+        <w:rPr/>
+      </w:pPr>
+      <w:r>
+        <w:rPr/>
+        <w:t>ФИО: {customer_rep_fio}</w:t>
+      </w:r>
+    </w:p>
+    <w:p>
+      <w:pPr>
+        <w:pStyle w:val="Normal"/>
+        <w:bidi w:val="0"/>
+        <w:jc w:val="start"/>
+        <w:rPr/>
+      </w:pPr>
+      <w:r>
+        <w:rPr/>
+        <w:t>Организация: {customer_rep_org}</w:t>
+      </w:r>
+    </w:p>
+    <w:p>
+      <w:pPr>
+        <w:pStyle w:val="Normal"/>
+        <w:bidi w:val="0"/>
+        <w:jc w:val="start"/>
+        <w:rPr/>
+      </w:pPr>
+      <w:r>
+        <w:rPr/>
+        <w:t>ИНН: {customer_rep_inn}</w:t>
+      </w:r>
+    </w:p>
+    <w:p>
+      <w:pPr>
+        <w:pStyle w:val="Normal"/>
+        <w:bidi w:val="0"/>
+        <w:jc w:val="start"/>
+        <w:rPr/>
+      </w:pPr>
+      <w:r>
+        <w:rPr/>
+        <w:t>{/customer_rep}</w:t>
+      </w:r>
+    </w:p>
+    <w:p>
+      <w:pPr>
+        <w:pStyle w:val="Normal"/>
+        <w:bidi w:val="0"/>
+        <w:jc w:val="start"/>
+        <w:rPr/>
+      </w:pPr>
+      <w:r>
+        <w:rPr/>
+      </w:r>
+    </w:p>
+    <w:p>
+      <w:pPr>
+        <w:pStyle w:val="Normal"/>
+        <w:bidi w:val="0"/>
+        <w:jc w:val="start"/>
+        <w:rPr/>
+      </w:pPr>
+      <w:r>
+        <w:rPr/>
+        <w:t>{#designer_rep}</w:t>
+      </w:r>
+    </w:p>
+    <w:p>
+      <w:pPr>
+        <w:pStyle w:val="Normal"/>
+        <w:bidi w:val="0"/>
+        <w:jc w:val="start"/>
+        <w:rPr/>
+      </w:pPr>
+      <w:r>
+        <w:rPr/>
+        <w:t>Представитель проектной организации:</w:t>
+      </w:r>
+    </w:p>
+    <w:p>
+      <w:pPr>
+        <w:pStyle w:val="Normal"/>
+        <w:bidi w:val="0"/>
+        <w:jc w:val="start"/>
+        <w:rPr/>
+      </w:pPr>
+      <w:r>
+        <w:rPr/>
+        <w:t>Должность: {designer_rep_pos}</w:t>
+      </w:r>
+    </w:p>
+    <w:p>
+      <w:pPr>
+        <w:pStyle w:val="Normal"/>
+        <w:bidi w:val="0"/>
+        <w:jc w:val="start"/>
+        <w:rPr/>
+      </w:pPr>
+      <w:r>
+        <w:rPr/>
+        <w:t>ФИО: {designer_rep_fio}</w:t>
+      </w:r>
+    </w:p>
+    <w:p>
+      <w:pPr>
+        <w:pStyle w:val="Normal"/>
+        <w:bidi w:val="0"/>
+        <w:jc w:val="start"/>
+        <w:rPr/>
+      </w:pPr>
+      <w:r>
+        <w:rPr/>
+        <w:t>Организация: {designer_rep_org}</w:t>
+      </w:r>
+    </w:p>
+    <w:p>
+      <w:pPr>
+        <w:pStyle w:val="Normal"/>
+        <w:bidi w:val="0"/>
+        <w:jc w:val="start"/>
+        <w:rPr/>
+      </w:pPr>
+      <w:r>
+        <w:rPr/>
+        <w:t>ИНН: {designer_rep_inn}</w:t>
+      </w:r>
+    </w:p>
+    <w:p>
+      <w:pPr>
+        <w:pStyle w:val="Normal"/>
+        <w:bidi w:val="0"/>
+        <w:jc w:val="start"/>
+        <w:rPr/>
+      </w:pPr>
+      <w:r>
+        <w:rPr/>
+        <w:t>{/designer_rep}</w:t>
       </w:r>
     </w:p>
     <w:sectPr>
@@ -224,6 +430,19 @@
     </w:pPr>
     <w:rPr>
       <w:rFonts w:cs="Noto Sans"/>
+    </w:rPr>
+  </w:style>
+  <w:style w:type="paragraph" w:styleId="Style16">
+    <w:name w:val="Текст в заданном формате"/>
+    <w:basedOn w:val="Normal"/>
+    <w:qFormat/>
+    <w:pPr>
+      <w:spacing w:before="0" w:after="0"/>
+    </w:pPr>
+    <w:rPr>
+      <w:rFonts w:ascii="Liberation Mono" w:hAnsi="Liberation Mono" w:eastAsia="Liberation Mono" w:cs="Liberation Mono"/>
+      <w:sz w:val="20"/>
+      <w:szCs w:val="20"/>
     </w:rPr>
   </w:style>
 </w:styles>

</xml_diff>